<commit_message>
Simplifie cahier des charges maillage en version cheat sheet client
Co-Authored-By: Claude Sonnet 4.6 <noreply@anthropic.com>
</commit_message>
<xml_diff>
--- a/clients/cofidis/livrables/cahier_des_charges_maillage_cofidis.docx
+++ b/clients/cofidis/livrables/cahier_des_charges_maillage_cofidis.docx
@@ -4,37 +4,322 @@
   <w:body>
     <w:p>
       <w:pPr>
-        <w:spacing w:after="40"/>
+        <w:spacing w:after="80"/>
       </w:pPr>
       <w:r>
         <w:rPr>
           <w:b/>
           <w:color w:val="1A1A2E"/>
-          <w:sz w:val="36"/>
+          <w:sz w:val="32"/>
         </w:rPr>
-        <w:t>Maillage interne — Règles par type de page</w:t>
+        <w:t>Règles de maillage interne — Cofidis</w:t>
       </w:r>
     </w:p>
     <w:p>
       <w:pPr>
-        <w:spacing w:after="80"/>
+        <w:spacing w:after="40"/>
       </w:pPr>
       <w:r>
-        <w:t>Sur chaque page de contenu, insérer des liens internes organisés en blocs. Ce document définit quels blocs mettre, combien de liens, et comment les sélectionner.</w:t>
+        <w:rPr>
+          <w:sz w:val="20"/>
+        </w:rPr>
+        <w:t>Principe : sur chaque page de contenu, ajouter des liens vers d'autres pages du même sujet, organisés en 4 blocs.</w:t>
       </w:r>
     </w:p>
     <w:p/>
     <w:p>
       <w:pPr>
-        <w:spacing w:before="280" w:after="80"/>
+        <w:spacing w:before="320" w:after="120"/>
       </w:pPr>
       <w:r>
         <w:rPr>
           <w:b/>
           <w:color w:val="1A1A2E"/>
-          <w:sz w:val="28"/>
+          <w:sz w:val="26"/>
         </w:rPr>
-        <w:t>1. Les 4 blocs disponibles</w:t>
+        <w:t>Règles par type de page</w:t>
+      </w:r>
+    </w:p>
+    <w:p>
+      <w:pPr>
+        <w:spacing w:before="200" w:after="40"/>
+      </w:pPr>
+      <w:r>
+        <w:rPr>
+          <w:b/>
+          <w:sz w:val="20"/>
+        </w:rPr>
+        <w:t>Page Q&amp;A</w:t>
+      </w:r>
+    </w:p>
+    <w:p>
+      <w:pPr>
+        <w:pStyle w:val="ListBullet"/>
+        <w:spacing w:after="20"/>
+        <w:ind w:left="283"/>
+      </w:pPr>
+      <w:r>
+        <w:rPr>
+          <w:sz w:val="20"/>
+        </w:rPr>
+        <w:t>5 liens vers d'autres Q&amp;A du même sujet (ex : "crédit cuisine")</w:t>
+      </w:r>
+    </w:p>
+    <w:p>
+      <w:pPr>
+        <w:pStyle w:val="ListBullet"/>
+        <w:spacing w:after="20"/>
+        <w:ind w:left="283"/>
+      </w:pPr>
+      <w:r>
+        <w:rPr>
+          <w:sz w:val="20"/>
+        </w:rPr>
+        <w:t>6 liens vers des guides du même sujet</w:t>
+      </w:r>
+    </w:p>
+    <w:p>
+      <w:pPr>
+        <w:pStyle w:val="ListBullet"/>
+        <w:spacing w:after="20"/>
+        <w:ind w:left="283"/>
+      </w:pPr>
+      <w:r>
+        <w:rPr>
+          <w:sz w:val="20"/>
+        </w:rPr>
+        <w:t>2 liens vers le ou les simulateurs du même sujet</w:t>
+      </w:r>
+    </w:p>
+    <w:p>
+      <w:pPr>
+        <w:pStyle w:val="ListBullet"/>
+        <w:spacing w:after="20"/>
+        <w:ind w:left="283"/>
+      </w:pPr>
+      <w:r>
+        <w:rPr>
+          <w:sz w:val="20"/>
+        </w:rPr>
+        <w:t>6 liens fixes (voir ci-dessous)</w:t>
+      </w:r>
+    </w:p>
+    <w:p>
+      <w:pPr>
+        <w:spacing w:before="200" w:after="40"/>
+      </w:pPr>
+      <w:r>
+        <w:rPr>
+          <w:b/>
+          <w:sz w:val="20"/>
+        </w:rPr>
+        <w:t>Page Guide</w:t>
+      </w:r>
+    </w:p>
+    <w:p>
+      <w:pPr>
+        <w:pStyle w:val="ListBullet"/>
+        <w:spacing w:after="20"/>
+        <w:ind w:left="283"/>
+      </w:pPr>
+      <w:r>
+        <w:rPr>
+          <w:sz w:val="20"/>
+        </w:rPr>
+        <w:t>5 liens vers des Q&amp;A du même sujet</w:t>
+      </w:r>
+    </w:p>
+    <w:p>
+      <w:pPr>
+        <w:pStyle w:val="ListBullet"/>
+        <w:spacing w:after="20"/>
+        <w:ind w:left="283"/>
+      </w:pPr>
+      <w:r>
+        <w:rPr>
+          <w:sz w:val="20"/>
+        </w:rPr>
+        <w:t>6 liens vers d'autres guides du même sujet</w:t>
+      </w:r>
+    </w:p>
+    <w:p>
+      <w:pPr>
+        <w:pStyle w:val="ListBullet"/>
+        <w:spacing w:after="20"/>
+        <w:ind w:left="283"/>
+      </w:pPr>
+      <w:r>
+        <w:rPr>
+          <w:sz w:val="20"/>
+        </w:rPr>
+        <w:t>2 liens vers le ou les simulateurs du même sujet</w:t>
+      </w:r>
+    </w:p>
+    <w:p>
+      <w:pPr>
+        <w:pStyle w:val="ListBullet"/>
+        <w:spacing w:after="20"/>
+        <w:ind w:left="283"/>
+      </w:pPr>
+      <w:r>
+        <w:rPr>
+          <w:sz w:val="20"/>
+        </w:rPr>
+        <w:t>6 liens fixes (voir ci-dessous)</w:t>
+      </w:r>
+    </w:p>
+    <w:p>
+      <w:pPr>
+        <w:spacing w:before="200" w:after="40"/>
+      </w:pPr>
+      <w:r>
+        <w:rPr>
+          <w:b/>
+          <w:sz w:val="20"/>
+        </w:rPr>
+        <w:t>Page Produit</w:t>
+      </w:r>
+    </w:p>
+    <w:p>
+      <w:pPr>
+        <w:pStyle w:val="ListBullet"/>
+        <w:spacing w:after="20"/>
+        <w:ind w:left="283"/>
+      </w:pPr>
+      <w:r>
+        <w:rPr>
+          <w:sz w:val="20"/>
+        </w:rPr>
+        <w:t>5 liens vers des Q&amp;A du même sujet</w:t>
+      </w:r>
+    </w:p>
+    <w:p>
+      <w:pPr>
+        <w:pStyle w:val="ListBullet"/>
+        <w:spacing w:after="20"/>
+        <w:ind w:left="283"/>
+      </w:pPr>
+      <w:r>
+        <w:rPr>
+          <w:sz w:val="20"/>
+        </w:rPr>
+        <w:t>6 liens vers des guides du même sujet</w:t>
+      </w:r>
+    </w:p>
+    <w:p>
+      <w:pPr>
+        <w:pStyle w:val="ListBullet"/>
+        <w:spacing w:after="20"/>
+        <w:ind w:left="283"/>
+      </w:pPr>
+      <w:r>
+        <w:rPr>
+          <w:sz w:val="20"/>
+        </w:rPr>
+        <w:t>2 liens vers le ou les simulateurs du même sujet</w:t>
+      </w:r>
+    </w:p>
+    <w:p>
+      <w:pPr>
+        <w:pStyle w:val="ListBullet"/>
+        <w:spacing w:after="20"/>
+        <w:ind w:left="283"/>
+      </w:pPr>
+      <w:r>
+        <w:rPr>
+          <w:sz w:val="20"/>
+        </w:rPr>
+        <w:t>6 liens fixes (voir ci-dessous)</w:t>
+      </w:r>
+    </w:p>
+    <w:p>
+      <w:pPr>
+        <w:spacing w:before="200" w:after="40"/>
+      </w:pPr>
+      <w:r>
+        <w:rPr>
+          <w:b/>
+          <w:sz w:val="20"/>
+        </w:rPr>
+        <w:t>Page Hub</w:t>
+      </w:r>
+    </w:p>
+    <w:p>
+      <w:pPr>
+        <w:pStyle w:val="ListBullet"/>
+        <w:spacing w:after="20"/>
+        <w:ind w:left="283"/>
+      </w:pPr>
+      <w:r>
+        <w:rPr>
+          <w:sz w:val="20"/>
+        </w:rPr>
+        <w:t>6 liens vers des guides du même sujet</w:t>
+      </w:r>
+    </w:p>
+    <w:p>
+      <w:pPr>
+        <w:pStyle w:val="ListBullet"/>
+        <w:spacing w:after="20"/>
+        <w:ind w:left="283"/>
+      </w:pPr>
+      <w:r>
+        <w:rPr>
+          <w:sz w:val="20"/>
+        </w:rPr>
+        <w:t>2 liens vers le ou les simulateurs du même sujet</w:t>
+      </w:r>
+    </w:p>
+    <w:p>
+      <w:pPr>
+        <w:pStyle w:val="ListBullet"/>
+        <w:spacing w:after="20"/>
+        <w:ind w:left="283"/>
+      </w:pPr>
+      <w:r>
+        <w:rPr>
+          <w:sz w:val="20"/>
+        </w:rPr>
+        <w:t>6 liens fixes (voir ci-dessous)</w:t>
+      </w:r>
+    </w:p>
+    <w:p>
+      <w:pPr>
+        <w:spacing w:before="200" w:after="40"/>
+      </w:pPr>
+      <w:r>
+        <w:rPr>
+          <w:b/>
+          <w:sz w:val="20"/>
+        </w:rPr>
+        <w:t>Simulateur / Lexique</w:t>
+      </w:r>
+    </w:p>
+    <w:p>
+      <w:pPr>
+        <w:pStyle w:val="ListBullet"/>
+        <w:spacing w:after="20"/>
+        <w:ind w:left="283"/>
+      </w:pPr>
+      <w:r>
+        <w:rPr>
+          <w:sz w:val="20"/>
+        </w:rPr>
+        <w:t>6 liens fixes uniquement (voir ci-dessous)</w:t>
+      </w:r>
+    </w:p>
+    <w:p/>
+    <w:p>
+      <w:pPr>
+        <w:spacing w:before="320" w:after="120"/>
+      </w:pPr>
+      <w:r>
+        <w:rPr>
+          <w:b/>
+          <w:color w:val="1A1A2E"/>
+          <w:sz w:val="26"/>
+        </w:rPr>
+        <w:t>Les 6 liens fixes (présents sur toutes les pages)</w:t>
       </w:r>
     </w:p>
     <w:tbl>
@@ -44,15 +329,163 @@
         <w:tblLook w:firstColumn="1" w:firstRow="1" w:lastColumn="0" w:lastRow="0" w:noHBand="0" w:noVBand="1" w:val="04A0"/>
       </w:tblPr>
       <w:tblGrid>
-        <w:gridCol w:w="3135"/>
-        <w:gridCol w:w="3135"/>
-        <w:gridCol w:w="3135"/>
+        <w:gridCol w:w="9406"/>
       </w:tblGrid>
       <w:tr>
         <w:tc>
           <w:tcPr>
-            <w:tcW w:type="dxa" w:w="3135"/>
-            <w:shd w:fill="1a1a2e" w:val="clear"/>
+            <w:tcW w:type="dxa" w:w="9406"/>
+            <w:shd w:fill="F5F5F5" w:val="clear"/>
+          </w:tcPr>
+          <w:p>
+            <w:pPr>
+              <w:spacing w:before="40" w:after="40"/>
+            </w:pPr>
+            <w:r>
+              <w:rPr>
+                <w:sz w:val="18"/>
+              </w:rPr>
+              <w:t>/fr/credit/simulation-credit.html</w:t>
+            </w:r>
+          </w:p>
+        </w:tc>
+      </w:tr>
+      <w:tr>
+        <w:tc>
+          <w:tcPr>
+            <w:tcW w:type="dxa" w:w="9406"/>
+            <w:shd w:fill="FFFFFF" w:val="clear"/>
+          </w:tcPr>
+          <w:p>
+            <w:pPr>
+              <w:spacing w:before="40" w:after="40"/>
+            </w:pPr>
+            <w:r>
+              <w:rPr>
+                <w:sz w:val="18"/>
+              </w:rPr>
+              <w:t>/fr/credit.html</w:t>
+            </w:r>
+          </w:p>
+        </w:tc>
+      </w:tr>
+      <w:tr>
+        <w:tc>
+          <w:tcPr>
+            <w:tcW w:type="dxa" w:w="9406"/>
+            <w:shd w:fill="F5F5F5" w:val="clear"/>
+          </w:tcPr>
+          <w:p>
+            <w:pPr>
+              <w:spacing w:before="40" w:after="40"/>
+            </w:pPr>
+            <w:r>
+              <w:rPr>
+                <w:sz w:val="18"/>
+              </w:rPr>
+              <w:t>/fr/pret-personnel/pret-sur-mesure.html</w:t>
+            </w:r>
+          </w:p>
+        </w:tc>
+      </w:tr>
+      <w:tr>
+        <w:tc>
+          <w:tcPr>
+            <w:tcW w:type="dxa" w:w="9406"/>
+            <w:shd w:fill="FFFFFF" w:val="clear"/>
+          </w:tcPr>
+          <w:p>
+            <w:pPr>
+              <w:spacing w:before="40" w:after="40"/>
+            </w:pPr>
+            <w:r>
+              <w:rPr>
+                <w:sz w:val="18"/>
+              </w:rPr>
+              <w:t>/fr/pret-personnel/simulation-pret.html</w:t>
+            </w:r>
+          </w:p>
+        </w:tc>
+      </w:tr>
+      <w:tr>
+        <w:tc>
+          <w:tcPr>
+            <w:tcW w:type="dxa" w:w="9406"/>
+            <w:shd w:fill="F5F5F5" w:val="clear"/>
+          </w:tcPr>
+          <w:p>
+            <w:pPr>
+              <w:spacing w:before="40" w:after="40"/>
+            </w:pPr>
+            <w:r>
+              <w:rPr>
+                <w:sz w:val="18"/>
+              </w:rPr>
+              <w:t>/fr/credit/credit-renouvelable.html</w:t>
+            </w:r>
+          </w:p>
+        </w:tc>
+      </w:tr>
+      <w:tr>
+        <w:tc>
+          <w:tcPr>
+            <w:tcW w:type="dxa" w:w="9406"/>
+            <w:shd w:fill="FFFFFF" w:val="clear"/>
+          </w:tcPr>
+          <w:p>
+            <w:pPr>
+              <w:spacing w:before="40" w:after="40"/>
+            </w:pPr>
+            <w:r>
+              <w:rPr>
+                <w:sz w:val="18"/>
+              </w:rPr>
+              <w:t>/fr/credit/credit-consommation.html</w:t>
+            </w:r>
+          </w:p>
+        </w:tc>
+      </w:tr>
+    </w:tbl>
+    <w:p/>
+    <w:p>
+      <w:pPr>
+        <w:spacing w:before="320" w:after="120"/>
+      </w:pPr>
+      <w:r>
+        <w:rPr>
+          <w:b/>
+          <w:color w:val="1A1A2E"/>
+          <w:sz w:val="26"/>
+        </w:rPr>
+        <w:t>Comment identifier le sujet d'une page</w:t>
+      </w:r>
+    </w:p>
+    <w:p>
+      <w:pPr>
+        <w:spacing w:after="80"/>
+      </w:pPr>
+      <w:r>
+        <w:rPr>
+          <w:sz w:val="20"/>
+        </w:rPr>
+        <w:t>Le sujet est déterminé par l'URL. Exemples :</w:t>
+      </w:r>
+    </w:p>
+    <w:tbl>
+      <w:tblPr>
+        <w:tblStyle w:val="TableGrid"/>
+        <w:tblW w:type="auto" w:w="0"/>
+        <w:tblLook w:firstColumn="1" w:firstRow="1" w:lastColumn="0" w:lastRow="0" w:noHBand="0" w:noVBand="1" w:val="04A0"/>
+      </w:tblPr>
+      <w:tblGrid>
+        <w:gridCol w:w="5669"/>
+        <w:gridCol w:w="2835"/>
+      </w:tblGrid>
+      <w:tr>
+        <w:tc>
+          <w:tcPr>
+            <w:tcW w:type="dxa" w:w="4703"/>
+            <w:shd w:fill="1A1A2E" w:val="clear"/>
           </w:tcPr>
           <w:p>
             <w:pPr>
@@ -64,14 +497,14 @@
                 <w:color w:val="FFFFFF"/>
                 <w:sz w:val="18"/>
               </w:rPr>
-              <w:t>Bloc</w:t>
+              <w:t>URL (début)</w:t>
             </w:r>
           </w:p>
         </w:tc>
         <w:tc>
           <w:tcPr>
-            <w:tcW w:type="dxa" w:w="3135"/>
-            <w:shd w:fill="1a1a2e" w:val="clear"/>
+            <w:tcW w:type="dxa" w:w="4703"/>
+            <w:shd w:fill="1A1A2E" w:val="clear"/>
           </w:tcPr>
           <w:p>
             <w:pPr>
@@ -83,26 +516,7 @@
                 <w:color w:val="FFFFFF"/>
                 <w:sz w:val="18"/>
               </w:rPr>
-              <w:t>Nom affiché (exemple)</w:t>
-            </w:r>
-          </w:p>
-        </w:tc>
-        <w:tc>
-          <w:tcPr>
-            <w:tcW w:type="dxa" w:w="3135"/>
-            <w:shd w:fill="1a1a2e" w:val="clear"/>
-          </w:tcPr>
-          <w:p>
-            <w:pPr>
-              <w:spacing w:before="40" w:after="40"/>
-            </w:pPr>
-            <w:r>
-              <w:rPr>
-                <w:b/>
-                <w:color w:val="FFFFFF"/>
-                <w:sz w:val="18"/>
-              </w:rPr>
-              <w:t>Contenu</w:t>
+              <w:t>Sujet</w:t>
             </w:r>
           </w:p>
         </w:tc>
@@ -110,7 +524,7 @@
       <w:tr>
         <w:tc>
           <w:tcPr>
-            <w:tcW w:type="dxa" w:w="3135"/>
+            <w:tcW w:type="dxa" w:w="4703"/>
             <w:shd w:fill="F5F5F5" w:val="clear"/>
           </w:tcPr>
           <w:p>
@@ -121,13 +535,13 @@
               <w:rPr>
                 <w:sz w:val="18"/>
               </w:rPr>
-              <w:t>BLOC Q&amp;A</w:t>
+              <w:t>/fr/pret-personnel/credit-cuisine/...</w:t>
             </w:r>
           </w:p>
         </w:tc>
         <w:tc>
           <w:tcPr>
-            <w:tcW w:type="dxa" w:w="3135"/>
+            <w:tcW w:type="dxa" w:w="4703"/>
             <w:shd w:fill="F5F5F5" w:val="clear"/>
           </w:tcPr>
           <w:p>
@@ -138,13 +552,51 @@
               <w:rPr>
                 <w:sz w:val="18"/>
               </w:rPr>
-              <w:t>"Questions fréquentes sur le même sujet"</w:t>
+              <w:t>sujet = Crédit cuisine</w:t>
+            </w:r>
+          </w:p>
+        </w:tc>
+      </w:tr>
+      <w:tr>
+        <w:tc>
+          <w:tcPr>
+            <w:tcW w:type="dxa" w:w="4703"/>
+            <w:shd w:fill="FFFFFF" w:val="clear"/>
+          </w:tcPr>
+          <w:p>
+            <w:pPr>
+              <w:spacing w:before="40" w:after="40"/>
+            </w:pPr>
+            <w:r>
+              <w:rPr>
+                <w:sz w:val="18"/>
+              </w:rPr>
+              <w:t>/fr/pret-renovation-energetique/...</w:t>
             </w:r>
           </w:p>
         </w:tc>
         <w:tc>
           <w:tcPr>
-            <w:tcW w:type="dxa" w:w="3135"/>
+            <w:tcW w:type="dxa" w:w="4703"/>
+            <w:shd w:fill="FFFFFF" w:val="clear"/>
+          </w:tcPr>
+          <w:p>
+            <w:pPr>
+              <w:spacing w:before="40" w:after="40"/>
+            </w:pPr>
+            <w:r>
+              <w:rPr>
+                <w:sz w:val="18"/>
+              </w:rPr>
+              <w:t>sujet = Rénovation énergétique</w:t>
+            </w:r>
+          </w:p>
+        </w:tc>
+      </w:tr>
+      <w:tr>
+        <w:tc>
+          <w:tcPr>
+            <w:tcW w:type="dxa" w:w="4703"/>
             <w:shd w:fill="F5F5F5" w:val="clear"/>
           </w:tcPr>
           <w:p>
@@ -155,7 +607,24 @@
               <w:rPr>
                 <w:sz w:val="18"/>
               </w:rPr>
-              <w:t>Pages Q&amp;A du même thème</w:t>
+              <w:t>/fr/pret-personnel/pret-travaux/...</w:t>
+            </w:r>
+          </w:p>
+        </w:tc>
+        <w:tc>
+          <w:tcPr>
+            <w:tcW w:type="dxa" w:w="4703"/>
+            <w:shd w:fill="F5F5F5" w:val="clear"/>
+          </w:tcPr>
+          <w:p>
+            <w:pPr>
+              <w:spacing w:before="40" w:after="40"/>
+            </w:pPr>
+            <w:r>
+              <w:rPr>
+                <w:sz w:val="18"/>
+              </w:rPr>
+              <w:t>sujet = Travaux</w:t>
             </w:r>
           </w:p>
         </w:tc>
@@ -163,7 +632,7 @@
       <w:tr>
         <w:tc>
           <w:tcPr>
-            <w:tcW w:type="dxa" w:w="3135"/>
+            <w:tcW w:type="dxa" w:w="4703"/>
             <w:shd w:fill="FFFFFF" w:val="clear"/>
           </w:tcPr>
           <w:p>
@@ -174,13 +643,13 @@
               <w:rPr>
                 <w:sz w:val="18"/>
               </w:rPr>
-              <w:t>BLOC GUIDE</w:t>
+              <w:t>/fr/credit/...</w:t>
             </w:r>
           </w:p>
         </w:tc>
         <w:tc>
           <w:tcPr>
-            <w:tcW w:type="dxa" w:w="3135"/>
+            <w:tcW w:type="dxa" w:w="4703"/>
             <w:shd w:fill="FFFFFF" w:val="clear"/>
           </w:tcPr>
           <w:p>
@@ -191,130 +660,7 @@
               <w:rPr>
                 <w:sz w:val="18"/>
               </w:rPr>
-              <w:t>"Besoin d'autres conseils sur le même thème ?"</w:t>
-            </w:r>
-          </w:p>
-        </w:tc>
-        <w:tc>
-          <w:tcPr>
-            <w:tcW w:type="dxa" w:w="3135"/>
-            <w:shd w:fill="FFFFFF" w:val="clear"/>
-          </w:tcPr>
-          <w:p>
-            <w:pPr>
-              <w:spacing w:before="40" w:after="40"/>
-            </w:pPr>
-            <w:r>
-              <w:rPr>
-                <w:sz w:val="18"/>
-              </w:rPr>
-              <w:t>Pages guides du même thème</w:t>
-            </w:r>
-          </w:p>
-        </w:tc>
-      </w:tr>
-      <w:tr>
-        <w:tc>
-          <w:tcPr>
-            <w:tcW w:type="dxa" w:w="3135"/>
-            <w:shd w:fill="F5F5F5" w:val="clear"/>
-          </w:tcPr>
-          <w:p>
-            <w:pPr>
-              <w:spacing w:before="40" w:after="40"/>
-            </w:pPr>
-            <w:r>
-              <w:rPr>
-                <w:sz w:val="18"/>
-              </w:rPr>
-              <w:t>BLOC INCONTOURNABLES</w:t>
-            </w:r>
-          </w:p>
-        </w:tc>
-        <w:tc>
-          <w:tcPr>
-            <w:tcW w:type="dxa" w:w="3135"/>
-            <w:shd w:fill="F5F5F5" w:val="clear"/>
-          </w:tcPr>
-          <w:p>
-            <w:pPr>
-              <w:spacing w:before="40" w:after="40"/>
-            </w:pPr>
-            <w:r>
-              <w:rPr>
-                <w:sz w:val="18"/>
-              </w:rPr>
-              <w:t>"À voir aussi"</w:t>
-            </w:r>
-          </w:p>
-        </w:tc>
-        <w:tc>
-          <w:tcPr>
-            <w:tcW w:type="dxa" w:w="3135"/>
-            <w:shd w:fill="F5F5F5" w:val="clear"/>
-          </w:tcPr>
-          <w:p>
-            <w:pPr>
-              <w:spacing w:before="40" w:after="40"/>
-            </w:pPr>
-            <w:r>
-              <w:rPr>
-                <w:sz w:val="18"/>
-              </w:rPr>
-              <w:t>6 pages fixes (simulateurs, pages produit clés)</w:t>
-            </w:r>
-          </w:p>
-        </w:tc>
-      </w:tr>
-      <w:tr>
-        <w:tc>
-          <w:tcPr>
-            <w:tcW w:type="dxa" w:w="3135"/>
-            <w:shd w:fill="FFFFFF" w:val="clear"/>
-          </w:tcPr>
-          <w:p>
-            <w:pPr>
-              <w:spacing w:before="40" w:after="40"/>
-            </w:pPr>
-            <w:r>
-              <w:rPr>
-                <w:sz w:val="18"/>
-              </w:rPr>
-              <w:t>BLOC OUTIL</w:t>
-            </w:r>
-          </w:p>
-        </w:tc>
-        <w:tc>
-          <w:tcPr>
-            <w:tcW w:type="dxa" w:w="3135"/>
-            <w:shd w:fill="FFFFFF" w:val="clear"/>
-          </w:tcPr>
-          <w:p>
-            <w:pPr>
-              <w:spacing w:before="40" w:after="40"/>
-            </w:pPr>
-            <w:r>
-              <w:rPr>
-                <w:sz w:val="18"/>
-              </w:rPr>
-              <w:t>"Estimez votre projet"</w:t>
-            </w:r>
-          </w:p>
-        </w:tc>
-        <w:tc>
-          <w:tcPr>
-            <w:tcW w:type="dxa" w:w="3135"/>
-            <w:shd w:fill="FFFFFF" w:val="clear"/>
-          </w:tcPr>
-          <w:p>
-            <w:pPr>
-              <w:spacing w:before="40" w:after="40"/>
-            </w:pPr>
-            <w:r>
-              <w:rPr>
-                <w:sz w:val="18"/>
-              </w:rPr>
-              <w:t>Simulateur(s) du même thème</w:t>
+              <w:t>sujet = Crédit général</w:t>
             </w:r>
           </w:p>
         </w:tc>
@@ -323,1720 +669,14 @@
     <w:p/>
     <w:p>
       <w:pPr>
-        <w:spacing w:before="280" w:after="80"/>
+        <w:spacing w:before="120"/>
       </w:pPr>
       <w:r>
         <w:rPr>
-          <w:b/>
-          <w:color w:val="1A1A2E"/>
-          <w:sz w:val="28"/>
+          <w:color w:val="888888"/>
+          <w:sz w:val="18"/>
         </w:rPr>
-        <w:t>2. Quels blocs activer selon le type de page</w:t>
-      </w:r>
-    </w:p>
-    <w:tbl>
-      <w:tblPr>
-        <w:tblStyle w:val="TableGrid"/>
-        <w:tblW w:type="auto" w:w="0"/>
-        <w:tblLook w:firstColumn="1" w:firstRow="1" w:lastColumn="0" w:lastRow="0" w:noHBand="0" w:noVBand="1" w:val="04A0"/>
-      </w:tblPr>
-      <w:tblGrid>
-        <w:gridCol w:w="1881"/>
-        <w:gridCol w:w="1881"/>
-        <w:gridCol w:w="1881"/>
-        <w:gridCol w:w="1881"/>
-        <w:gridCol w:w="1881"/>
-      </w:tblGrid>
-      <w:tr>
-        <w:tc>
-          <w:tcPr>
-            <w:tcW w:type="dxa" w:w="1881"/>
-            <w:shd w:fill="1a1a2e" w:val="clear"/>
-          </w:tcPr>
-          <w:p>
-            <w:pPr>
-              <w:spacing w:before="40" w:after="40"/>
-            </w:pPr>
-            <w:r>
-              <w:rPr>
-                <w:b/>
-                <w:color w:val="FFFFFF"/>
-                <w:sz w:val="18"/>
-              </w:rPr>
-              <w:t>Type de page</w:t>
-            </w:r>
-          </w:p>
-        </w:tc>
-        <w:tc>
-          <w:tcPr>
-            <w:tcW w:type="dxa" w:w="1881"/>
-            <w:shd w:fill="1a1a2e" w:val="clear"/>
-          </w:tcPr>
-          <w:p>
-            <w:pPr>
-              <w:spacing w:before="40" w:after="40"/>
-            </w:pPr>
-            <w:r>
-              <w:rPr>
-                <w:b/>
-                <w:color w:val="FFFFFF"/>
-                <w:sz w:val="18"/>
-              </w:rPr>
-              <w:t>BLOC Q&amp;A</w:t>
-            </w:r>
-          </w:p>
-        </w:tc>
-        <w:tc>
-          <w:tcPr>
-            <w:tcW w:type="dxa" w:w="1881"/>
-            <w:shd w:fill="1a1a2e" w:val="clear"/>
-          </w:tcPr>
-          <w:p>
-            <w:pPr>
-              <w:spacing w:before="40" w:after="40"/>
-            </w:pPr>
-            <w:r>
-              <w:rPr>
-                <w:b/>
-                <w:color w:val="FFFFFF"/>
-                <w:sz w:val="18"/>
-              </w:rPr>
-              <w:t>BLOC GUIDE</w:t>
-            </w:r>
-          </w:p>
-        </w:tc>
-        <w:tc>
-          <w:tcPr>
-            <w:tcW w:type="dxa" w:w="1881"/>
-            <w:shd w:fill="1a1a2e" w:val="clear"/>
-          </w:tcPr>
-          <w:p>
-            <w:pPr>
-              <w:spacing w:before="40" w:after="40"/>
-            </w:pPr>
-            <w:r>
-              <w:rPr>
-                <w:b/>
-                <w:color w:val="FFFFFF"/>
-                <w:sz w:val="18"/>
-              </w:rPr>
-              <w:t>BLOC INCONTOURNABLES</w:t>
-            </w:r>
-          </w:p>
-        </w:tc>
-        <w:tc>
-          <w:tcPr>
-            <w:tcW w:type="dxa" w:w="1881"/>
-            <w:shd w:fill="1a1a2e" w:val="clear"/>
-          </w:tcPr>
-          <w:p>
-            <w:pPr>
-              <w:spacing w:before="40" w:after="40"/>
-            </w:pPr>
-            <w:r>
-              <w:rPr>
-                <w:b/>
-                <w:color w:val="FFFFFF"/>
-                <w:sz w:val="18"/>
-              </w:rPr>
-              <w:t>BLOC OUTIL</w:t>
-            </w:r>
-          </w:p>
-        </w:tc>
-      </w:tr>
-      <w:tr>
-        <w:tc>
-          <w:tcPr>
-            <w:tcW w:type="dxa" w:w="1881"/>
-            <w:shd w:fill="F5F5F5" w:val="clear"/>
-          </w:tcPr>
-          <w:p>
-            <w:pPr>
-              <w:spacing w:before="40" w:after="40"/>
-            </w:pPr>
-            <w:r>
-              <w:rPr>
-                <w:sz w:val="18"/>
-              </w:rPr>
-              <w:t>Page Q&amp;A</w:t>
-            </w:r>
-          </w:p>
-        </w:tc>
-        <w:tc>
-          <w:tcPr>
-            <w:tcW w:type="dxa" w:w="1881"/>
-            <w:shd w:fill="F5F5F5" w:val="clear"/>
-          </w:tcPr>
-          <w:p>
-            <w:pPr>
-              <w:spacing w:before="40" w:after="40"/>
-            </w:pPr>
-            <w:r>
-              <w:rPr>
-                <w:sz w:val="18"/>
-              </w:rPr>
-              <w:t>✅ 5 liens</w:t>
-            </w:r>
-          </w:p>
-        </w:tc>
-        <w:tc>
-          <w:tcPr>
-            <w:tcW w:type="dxa" w:w="1881"/>
-            <w:shd w:fill="F5F5F5" w:val="clear"/>
-          </w:tcPr>
-          <w:p>
-            <w:pPr>
-              <w:spacing w:before="40" w:after="40"/>
-            </w:pPr>
-            <w:r>
-              <w:rPr>
-                <w:sz w:val="18"/>
-              </w:rPr>
-              <w:t>✅ 6 liens</w:t>
-            </w:r>
-          </w:p>
-        </w:tc>
-        <w:tc>
-          <w:tcPr>
-            <w:tcW w:type="dxa" w:w="1881"/>
-            <w:shd w:fill="F5F5F5" w:val="clear"/>
-          </w:tcPr>
-          <w:p>
-            <w:pPr>
-              <w:spacing w:before="40" w:after="40"/>
-            </w:pPr>
-            <w:r>
-              <w:rPr>
-                <w:sz w:val="18"/>
-              </w:rPr>
-              <w:t>✅ 6 liens</w:t>
-            </w:r>
-          </w:p>
-        </w:tc>
-        <w:tc>
-          <w:tcPr>
-            <w:tcW w:type="dxa" w:w="1881"/>
-            <w:shd w:fill="F5F5F5" w:val="clear"/>
-          </w:tcPr>
-          <w:p>
-            <w:pPr>
-              <w:spacing w:before="40" w:after="40"/>
-            </w:pPr>
-            <w:r>
-              <w:rPr>
-                <w:sz w:val="18"/>
-              </w:rPr>
-              <w:t>✅ 2 liens</w:t>
-            </w:r>
-          </w:p>
-        </w:tc>
-      </w:tr>
-      <w:tr>
-        <w:tc>
-          <w:tcPr>
-            <w:tcW w:type="dxa" w:w="1881"/>
-            <w:shd w:fill="FFFFFF" w:val="clear"/>
-          </w:tcPr>
-          <w:p>
-            <w:pPr>
-              <w:spacing w:before="40" w:after="40"/>
-            </w:pPr>
-            <w:r>
-              <w:rPr>
-                <w:sz w:val="18"/>
-              </w:rPr>
-              <w:t>Page Guide</w:t>
-            </w:r>
-          </w:p>
-        </w:tc>
-        <w:tc>
-          <w:tcPr>
-            <w:tcW w:type="dxa" w:w="1881"/>
-            <w:shd w:fill="FFFFFF" w:val="clear"/>
-          </w:tcPr>
-          <w:p>
-            <w:pPr>
-              <w:spacing w:before="40" w:after="40"/>
-            </w:pPr>
-            <w:r>
-              <w:rPr>
-                <w:sz w:val="18"/>
-              </w:rPr>
-              <w:t>✅ 5 liens</w:t>
-            </w:r>
-          </w:p>
-        </w:tc>
-        <w:tc>
-          <w:tcPr>
-            <w:tcW w:type="dxa" w:w="1881"/>
-            <w:shd w:fill="FFFFFF" w:val="clear"/>
-          </w:tcPr>
-          <w:p>
-            <w:pPr>
-              <w:spacing w:before="40" w:after="40"/>
-            </w:pPr>
-            <w:r>
-              <w:rPr>
-                <w:sz w:val="18"/>
-              </w:rPr>
-              <w:t>✅ 6 liens</w:t>
-            </w:r>
-          </w:p>
-        </w:tc>
-        <w:tc>
-          <w:tcPr>
-            <w:tcW w:type="dxa" w:w="1881"/>
-            <w:shd w:fill="FFFFFF" w:val="clear"/>
-          </w:tcPr>
-          <w:p>
-            <w:pPr>
-              <w:spacing w:before="40" w:after="40"/>
-            </w:pPr>
-            <w:r>
-              <w:rPr>
-                <w:sz w:val="18"/>
-              </w:rPr>
-              <w:t>✅ 6 liens</w:t>
-            </w:r>
-          </w:p>
-        </w:tc>
-        <w:tc>
-          <w:tcPr>
-            <w:tcW w:type="dxa" w:w="1881"/>
-            <w:shd w:fill="FFFFFF" w:val="clear"/>
-          </w:tcPr>
-          <w:p>
-            <w:pPr>
-              <w:spacing w:before="40" w:after="40"/>
-            </w:pPr>
-            <w:r>
-              <w:rPr>
-                <w:sz w:val="18"/>
-              </w:rPr>
-              <w:t>✅ 2 liens</w:t>
-            </w:r>
-          </w:p>
-        </w:tc>
-      </w:tr>
-      <w:tr>
-        <w:tc>
-          <w:tcPr>
-            <w:tcW w:type="dxa" w:w="1881"/>
-            <w:shd w:fill="F5F5F5" w:val="clear"/>
-          </w:tcPr>
-          <w:p>
-            <w:pPr>
-              <w:spacing w:before="40" w:after="40"/>
-            </w:pPr>
-            <w:r>
-              <w:rPr>
-                <w:sz w:val="18"/>
-              </w:rPr>
-              <w:t>Page Produit</w:t>
-            </w:r>
-          </w:p>
-        </w:tc>
-        <w:tc>
-          <w:tcPr>
-            <w:tcW w:type="dxa" w:w="1881"/>
-            <w:shd w:fill="F5F5F5" w:val="clear"/>
-          </w:tcPr>
-          <w:p>
-            <w:pPr>
-              <w:spacing w:before="40" w:after="40"/>
-            </w:pPr>
-            <w:r>
-              <w:rPr>
-                <w:sz w:val="18"/>
-              </w:rPr>
-              <w:t>✅ 5 liens</w:t>
-            </w:r>
-          </w:p>
-        </w:tc>
-        <w:tc>
-          <w:tcPr>
-            <w:tcW w:type="dxa" w:w="1881"/>
-            <w:shd w:fill="F5F5F5" w:val="clear"/>
-          </w:tcPr>
-          <w:p>
-            <w:pPr>
-              <w:spacing w:before="40" w:after="40"/>
-            </w:pPr>
-            <w:r>
-              <w:rPr>
-                <w:sz w:val="18"/>
-              </w:rPr>
-              <w:t>✅ 6 liens</w:t>
-            </w:r>
-          </w:p>
-        </w:tc>
-        <w:tc>
-          <w:tcPr>
-            <w:tcW w:type="dxa" w:w="1881"/>
-            <w:shd w:fill="F5F5F5" w:val="clear"/>
-          </w:tcPr>
-          <w:p>
-            <w:pPr>
-              <w:spacing w:before="40" w:after="40"/>
-            </w:pPr>
-            <w:r>
-              <w:rPr>
-                <w:sz w:val="18"/>
-              </w:rPr>
-              <w:t>✅ 6 liens</w:t>
-            </w:r>
-          </w:p>
-        </w:tc>
-        <w:tc>
-          <w:tcPr>
-            <w:tcW w:type="dxa" w:w="1881"/>
-            <w:shd w:fill="F5F5F5" w:val="clear"/>
-          </w:tcPr>
-          <w:p>
-            <w:pPr>
-              <w:spacing w:before="40" w:after="40"/>
-            </w:pPr>
-            <w:r>
-              <w:rPr>
-                <w:sz w:val="18"/>
-              </w:rPr>
-              <w:t>✅ 2 liens</w:t>
-            </w:r>
-          </w:p>
-        </w:tc>
-      </w:tr>
-      <w:tr>
-        <w:tc>
-          <w:tcPr>
-            <w:tcW w:type="dxa" w:w="1881"/>
-            <w:shd w:fill="FFFFFF" w:val="clear"/>
-          </w:tcPr>
-          <w:p>
-            <w:pPr>
-              <w:spacing w:before="40" w:after="40"/>
-            </w:pPr>
-            <w:r>
-              <w:rPr>
-                <w:sz w:val="18"/>
-              </w:rPr>
-              <w:t>Page Hub</w:t>
-            </w:r>
-          </w:p>
-        </w:tc>
-        <w:tc>
-          <w:tcPr>
-            <w:tcW w:type="dxa" w:w="1881"/>
-            <w:shd w:fill="FFFFFF" w:val="clear"/>
-          </w:tcPr>
-          <w:p>
-            <w:pPr>
-              <w:spacing w:before="40" w:after="40"/>
-            </w:pPr>
-            <w:r>
-              <w:rPr>
-                <w:sz w:val="18"/>
-              </w:rPr>
-              <w:t>—</w:t>
-            </w:r>
-          </w:p>
-        </w:tc>
-        <w:tc>
-          <w:tcPr>
-            <w:tcW w:type="dxa" w:w="1881"/>
-            <w:shd w:fill="FFFFFF" w:val="clear"/>
-          </w:tcPr>
-          <w:p>
-            <w:pPr>
-              <w:spacing w:before="40" w:after="40"/>
-            </w:pPr>
-            <w:r>
-              <w:rPr>
-                <w:sz w:val="18"/>
-              </w:rPr>
-              <w:t>✅ 6 liens</w:t>
-            </w:r>
-          </w:p>
-        </w:tc>
-        <w:tc>
-          <w:tcPr>
-            <w:tcW w:type="dxa" w:w="1881"/>
-            <w:shd w:fill="FFFFFF" w:val="clear"/>
-          </w:tcPr>
-          <w:p>
-            <w:pPr>
-              <w:spacing w:before="40" w:after="40"/>
-            </w:pPr>
-            <w:r>
-              <w:rPr>
-                <w:sz w:val="18"/>
-              </w:rPr>
-              <w:t>✅ 6 liens</w:t>
-            </w:r>
-          </w:p>
-        </w:tc>
-        <w:tc>
-          <w:tcPr>
-            <w:tcW w:type="dxa" w:w="1881"/>
-            <w:shd w:fill="FFFFFF" w:val="clear"/>
-          </w:tcPr>
-          <w:p>
-            <w:pPr>
-              <w:spacing w:before="40" w:after="40"/>
-            </w:pPr>
-            <w:r>
-              <w:rPr>
-                <w:sz w:val="18"/>
-              </w:rPr>
-              <w:t>✅ 2 liens</w:t>
-            </w:r>
-          </w:p>
-        </w:tc>
-      </w:tr>
-      <w:tr>
-        <w:tc>
-          <w:tcPr>
-            <w:tcW w:type="dxa" w:w="1881"/>
-            <w:shd w:fill="F5F5F5" w:val="clear"/>
-          </w:tcPr>
-          <w:p>
-            <w:pPr>
-              <w:spacing w:before="40" w:after="40"/>
-            </w:pPr>
-            <w:r>
-              <w:rPr>
-                <w:sz w:val="18"/>
-              </w:rPr>
-              <w:t>Outil / Simulateur</w:t>
-            </w:r>
-          </w:p>
-        </w:tc>
-        <w:tc>
-          <w:tcPr>
-            <w:tcW w:type="dxa" w:w="1881"/>
-            <w:shd w:fill="F5F5F5" w:val="clear"/>
-          </w:tcPr>
-          <w:p>
-            <w:pPr>
-              <w:spacing w:before="40" w:after="40"/>
-            </w:pPr>
-            <w:r>
-              <w:rPr>
-                <w:sz w:val="18"/>
-              </w:rPr>
-              <w:t>—</w:t>
-            </w:r>
-          </w:p>
-        </w:tc>
-        <w:tc>
-          <w:tcPr>
-            <w:tcW w:type="dxa" w:w="1881"/>
-            <w:shd w:fill="F5F5F5" w:val="clear"/>
-          </w:tcPr>
-          <w:p>
-            <w:pPr>
-              <w:spacing w:before="40" w:after="40"/>
-            </w:pPr>
-            <w:r>
-              <w:rPr>
-                <w:sz w:val="18"/>
-              </w:rPr>
-              <w:t>—</w:t>
-            </w:r>
-          </w:p>
-        </w:tc>
-        <w:tc>
-          <w:tcPr>
-            <w:tcW w:type="dxa" w:w="1881"/>
-            <w:shd w:fill="F5F5F5" w:val="clear"/>
-          </w:tcPr>
-          <w:p>
-            <w:pPr>
-              <w:spacing w:before="40" w:after="40"/>
-            </w:pPr>
-            <w:r>
-              <w:rPr>
-                <w:sz w:val="18"/>
-              </w:rPr>
-              <w:t>✅ 6 liens</w:t>
-            </w:r>
-          </w:p>
-        </w:tc>
-        <w:tc>
-          <w:tcPr>
-            <w:tcW w:type="dxa" w:w="1881"/>
-            <w:shd w:fill="F5F5F5" w:val="clear"/>
-          </w:tcPr>
-          <w:p>
-            <w:pPr>
-              <w:spacing w:before="40" w:after="40"/>
-            </w:pPr>
-            <w:r>
-              <w:rPr>
-                <w:sz w:val="18"/>
-              </w:rPr>
-              <w:t>—</w:t>
-            </w:r>
-          </w:p>
-        </w:tc>
-      </w:tr>
-      <w:tr>
-        <w:tc>
-          <w:tcPr>
-            <w:tcW w:type="dxa" w:w="1881"/>
-            <w:shd w:fill="FFFFFF" w:val="clear"/>
-          </w:tcPr>
-          <w:p>
-            <w:pPr>
-              <w:spacing w:before="40" w:after="40"/>
-            </w:pPr>
-            <w:r>
-              <w:rPr>
-                <w:sz w:val="18"/>
-              </w:rPr>
-              <w:t>Lexique</w:t>
-            </w:r>
-          </w:p>
-        </w:tc>
-        <w:tc>
-          <w:tcPr>
-            <w:tcW w:type="dxa" w:w="1881"/>
-            <w:shd w:fill="FFFFFF" w:val="clear"/>
-          </w:tcPr>
-          <w:p>
-            <w:pPr>
-              <w:spacing w:before="40" w:after="40"/>
-            </w:pPr>
-            <w:r>
-              <w:rPr>
-                <w:sz w:val="18"/>
-              </w:rPr>
-              <w:t>—</w:t>
-            </w:r>
-          </w:p>
-        </w:tc>
-        <w:tc>
-          <w:tcPr>
-            <w:tcW w:type="dxa" w:w="1881"/>
-            <w:shd w:fill="FFFFFF" w:val="clear"/>
-          </w:tcPr>
-          <w:p>
-            <w:pPr>
-              <w:spacing w:before="40" w:after="40"/>
-            </w:pPr>
-            <w:r>
-              <w:rPr>
-                <w:sz w:val="18"/>
-              </w:rPr>
-              <w:t>—</w:t>
-            </w:r>
-          </w:p>
-        </w:tc>
-        <w:tc>
-          <w:tcPr>
-            <w:tcW w:type="dxa" w:w="1881"/>
-            <w:shd w:fill="FFFFFF" w:val="clear"/>
-          </w:tcPr>
-          <w:p>
-            <w:pPr>
-              <w:spacing w:before="40" w:after="40"/>
-            </w:pPr>
-            <w:r>
-              <w:rPr>
-                <w:sz w:val="18"/>
-              </w:rPr>
-              <w:t>✅ 6 liens</w:t>
-            </w:r>
-          </w:p>
-        </w:tc>
-        <w:tc>
-          <w:tcPr>
-            <w:tcW w:type="dxa" w:w="1881"/>
-            <w:shd w:fill="FFFFFF" w:val="clear"/>
-          </w:tcPr>
-          <w:p>
-            <w:pPr>
-              <w:spacing w:before="40" w:after="40"/>
-            </w:pPr>
-            <w:r>
-              <w:rPr>
-                <w:sz w:val="18"/>
-              </w:rPr>
-              <w:t>—</w:t>
-            </w:r>
-          </w:p>
-        </w:tc>
-      </w:tr>
-    </w:tbl>
-    <w:p/>
-    <w:p>
-      <w:pPr>
-        <w:spacing w:before="280" w:after="80"/>
-      </w:pPr>
-      <w:r>
-        <w:rPr>
-          <w:b/>
-          <w:color w:val="1A1A2E"/>
-          <w:sz w:val="28"/>
-        </w:rPr>
-        <w:t>3. Comment sélectionner les liens de chaque bloc</w:t>
-      </w:r>
-    </w:p>
-    <w:p>
-      <w:pPr>
-        <w:spacing w:before="160" w:after="80"/>
-      </w:pPr>
-      <w:r>
-        <w:rPr>
-          <w:b/>
-          <w:color w:val="333333"/>
-          <w:sz w:val="22"/>
-        </w:rPr>
-        <w:t>BLOC Q&amp;A — 5 liens</w:t>
-      </w:r>
-    </w:p>
-    <w:p>
-      <w:pPr>
-        <w:pStyle w:val="ListBullet"/>
-        <w:spacing w:after="40"/>
-      </w:pPr>
-      <w:r>
-        <w:rPr>
-          <w:sz w:val="20"/>
-        </w:rPr>
-        <w:t>Prendre les pages Q&amp;A du même thème (ex : toutes les Q&amp;A "crédit cuisine")</w:t>
-      </w:r>
-    </w:p>
-    <w:p>
-      <w:pPr>
-        <w:pStyle w:val="ListBullet"/>
-        <w:spacing w:after="40"/>
-      </w:pPr>
-      <w:r>
-        <w:rPr>
-          <w:sz w:val="20"/>
-        </w:rPr>
-        <w:t>Exclure la page en cours</w:t>
-      </w:r>
-    </w:p>
-    <w:p>
-      <w:pPr>
-        <w:spacing w:before="160" w:after="80"/>
-      </w:pPr>
-      <w:r>
-        <w:rPr>
-          <w:b/>
-          <w:color w:val="333333"/>
-          <w:sz w:val="22"/>
-        </w:rPr>
-        <w:t>BLOC GUIDE — 6 liens</w:t>
-      </w:r>
-    </w:p>
-    <w:p>
-      <w:pPr>
-        <w:pStyle w:val="ListBullet"/>
-        <w:spacing w:after="40"/>
-      </w:pPr>
-      <w:r>
-        <w:rPr>
-          <w:sz w:val="20"/>
-        </w:rPr>
-        <w:t>Prendre les pages Guide du même thème</w:t>
-      </w:r>
-    </w:p>
-    <w:p>
-      <w:pPr>
-        <w:pStyle w:val="ListBullet"/>
-        <w:spacing w:after="40"/>
-      </w:pPr>
-      <w:r>
-        <w:rPr>
-          <w:sz w:val="20"/>
-        </w:rPr>
-        <w:t>Si moins de 4 guides dans le thème : compléter avec des guides de thèmes proches (voir §4)</w:t>
-      </w:r>
-    </w:p>
-    <w:p>
-      <w:pPr>
-        <w:pStyle w:val="ListBullet"/>
-        <w:spacing w:after="40"/>
-      </w:pPr>
-      <w:r>
-        <w:rPr>
-          <w:sz w:val="20"/>
-        </w:rPr>
-        <w:t>Exclure la page en cours</w:t>
-      </w:r>
-    </w:p>
-    <w:p>
-      <w:pPr>
-        <w:spacing w:before="160" w:after="80"/>
-      </w:pPr>
-      <w:r>
-        <w:rPr>
-          <w:b/>
-          <w:color w:val="333333"/>
-          <w:sz w:val="22"/>
-        </w:rPr>
-        <w:t>BLOC INCONTOURNABLES — 6 liens fixes</w:t>
-      </w:r>
-    </w:p>
-    <w:p>
-      <w:pPr>
-        <w:spacing w:after="80"/>
-      </w:pPr>
-      <w:r>
-        <w:t>Ces 6 pages apparaissent sur toutes les pages, sans exception :</w:t>
-      </w:r>
-    </w:p>
-    <w:p>
-      <w:pPr>
-        <w:pStyle w:val="ListBullet"/>
-        <w:spacing w:after="40"/>
-      </w:pPr>
-      <w:r>
-        <w:rPr>
-          <w:sz w:val="20"/>
-        </w:rPr>
-        <w:t>/fr/credit/simulation-credit.html</w:t>
-      </w:r>
-    </w:p>
-    <w:p>
-      <w:pPr>
-        <w:pStyle w:val="ListBullet"/>
-        <w:spacing w:after="40"/>
-      </w:pPr>
-      <w:r>
-        <w:rPr>
-          <w:sz w:val="20"/>
-        </w:rPr>
-        <w:t>/fr/credit.html</w:t>
-      </w:r>
-    </w:p>
-    <w:p>
-      <w:pPr>
-        <w:pStyle w:val="ListBullet"/>
-        <w:spacing w:after="40"/>
-      </w:pPr>
-      <w:r>
-        <w:rPr>
-          <w:sz w:val="20"/>
-        </w:rPr>
-        <w:t>/fr/pret-personnel/pret-sur-mesure.html</w:t>
-      </w:r>
-    </w:p>
-    <w:p>
-      <w:pPr>
-        <w:pStyle w:val="ListBullet"/>
-        <w:spacing w:after="40"/>
-      </w:pPr>
-      <w:r>
-        <w:rPr>
-          <w:sz w:val="20"/>
-        </w:rPr>
-        <w:t>/fr/pret-personnel/simulation-pret.html</w:t>
-      </w:r>
-    </w:p>
-    <w:p>
-      <w:pPr>
-        <w:pStyle w:val="ListBullet"/>
-        <w:spacing w:after="40"/>
-      </w:pPr>
-      <w:r>
-        <w:rPr>
-          <w:sz w:val="20"/>
-        </w:rPr>
-        <w:t>/fr/credit/credit-renouvelable.html</w:t>
-      </w:r>
-    </w:p>
-    <w:p>
-      <w:pPr>
-        <w:pStyle w:val="ListBullet"/>
-        <w:spacing w:after="40"/>
-      </w:pPr>
-      <w:r>
-        <w:rPr>
-          <w:sz w:val="20"/>
-        </w:rPr>
-        <w:t>/fr/credit/credit-consommation.html</w:t>
-      </w:r>
-    </w:p>
-    <w:p>
-      <w:pPr>
-        <w:spacing w:before="160" w:after="80"/>
-      </w:pPr>
-      <w:r>
-        <w:rPr>
-          <w:b/>
-          <w:color w:val="333333"/>
-          <w:sz w:val="22"/>
-        </w:rPr>
-        <w:t>BLOC OUTIL — 2 liens</w:t>
-      </w:r>
-    </w:p>
-    <w:p>
-      <w:pPr>
-        <w:pStyle w:val="ListBullet"/>
-        <w:spacing w:after="40"/>
-      </w:pPr>
-      <w:r>
-        <w:rPr>
-          <w:sz w:val="20"/>
-        </w:rPr>
-        <w:t>Prendre le ou les simulateurs du même thème</w:t>
-      </w:r>
-    </w:p>
-    <w:p>
-      <w:pPr>
-        <w:pStyle w:val="ListBullet"/>
-        <w:spacing w:after="40"/>
-      </w:pPr>
-      <w:r>
-        <w:rPr>
-          <w:sz w:val="20"/>
-        </w:rPr>
-        <w:t>Si aucun simulateur thématique : utiliser /fr/pret-personnel/simulation-pret.html par défaut</w:t>
-      </w:r>
-    </w:p>
-    <w:p/>
-    <w:p>
-      <w:pPr>
-        <w:spacing w:before="280" w:after="80"/>
-      </w:pPr>
-      <w:r>
-        <w:rPr>
-          <w:b/>
-          <w:color w:val="1A1A2E"/>
-          <w:sz w:val="28"/>
-        </w:rPr>
-        <w:t>4. Organisation par thème</w:t>
-      </w:r>
-    </w:p>
-    <w:p>
-      <w:pPr>
-        <w:spacing w:after="80"/>
-      </w:pPr>
-      <w:r>
-        <w:t>Chaque page appartient à un thème, déterminé par son URL.</w:t>
-      </w:r>
-    </w:p>
-    <w:tbl>
-      <w:tblPr>
-        <w:tblStyle w:val="TableGrid"/>
-        <w:tblW w:type="auto" w:w="0"/>
-        <w:tblLook w:firstColumn="1" w:firstRow="1" w:lastColumn="0" w:lastRow="0" w:noHBand="0" w:noVBand="1" w:val="04A0"/>
-      </w:tblPr>
-      <w:tblGrid>
-        <w:gridCol w:w="3135"/>
-        <w:gridCol w:w="3135"/>
-        <w:gridCol w:w="3135"/>
-      </w:tblGrid>
-      <w:tr>
-        <w:tc>
-          <w:tcPr>
-            <w:tcW w:type="dxa" w:w="3135"/>
-            <w:shd w:fill="1a1a2e" w:val="clear"/>
-          </w:tcPr>
-          <w:p>
-            <w:pPr>
-              <w:spacing w:before="40" w:after="40"/>
-            </w:pPr>
-            <w:r>
-              <w:rPr>
-                <w:b/>
-                <w:color w:val="FFFFFF"/>
-                <w:sz w:val="18"/>
-              </w:rPr>
-              <w:t>Thème</w:t>
-            </w:r>
-          </w:p>
-        </w:tc>
-        <w:tc>
-          <w:tcPr>
-            <w:tcW w:type="dxa" w:w="3135"/>
-            <w:shd w:fill="1a1a2e" w:val="clear"/>
-          </w:tcPr>
-          <w:p>
-            <w:pPr>
-              <w:spacing w:before="40" w:after="40"/>
-            </w:pPr>
-            <w:r>
-              <w:rPr>
-                <w:b/>
-                <w:color w:val="FFFFFF"/>
-                <w:sz w:val="18"/>
-              </w:rPr>
-              <w:t>URLs concernées (début)</w:t>
-            </w:r>
-          </w:p>
-        </w:tc>
-        <w:tc>
-          <w:tcPr>
-            <w:tcW w:type="dxa" w:w="3135"/>
-            <w:shd w:fill="1a1a2e" w:val="clear"/>
-          </w:tcPr>
-          <w:p>
-            <w:pPr>
-              <w:spacing w:before="40" w:after="40"/>
-            </w:pPr>
-            <w:r>
-              <w:rPr>
-                <w:b/>
-                <w:color w:val="FFFFFF"/>
-                <w:sz w:val="18"/>
-              </w:rPr>
-              <w:t>Thèmes proches (pour compléter BLOC GUIDE)</w:t>
-            </w:r>
-          </w:p>
-        </w:tc>
-      </w:tr>
-      <w:tr>
-        <w:tc>
-          <w:tcPr>
-            <w:tcW w:type="dxa" w:w="3135"/>
-            <w:shd w:fill="F5F5F5" w:val="clear"/>
-          </w:tcPr>
-          <w:p>
-            <w:pPr>
-              <w:spacing w:before="40" w:after="40"/>
-            </w:pPr>
-            <w:r>
-              <w:rPr>
-                <w:sz w:val="18"/>
-              </w:rPr>
-              <w:t>Rénovation énergétique</w:t>
-            </w:r>
-          </w:p>
-        </w:tc>
-        <w:tc>
-          <w:tcPr>
-            <w:tcW w:type="dxa" w:w="3135"/>
-            <w:shd w:fill="F5F5F5" w:val="clear"/>
-          </w:tcPr>
-          <w:p>
-            <w:pPr>
-              <w:spacing w:before="40" w:after="40"/>
-            </w:pPr>
-            <w:r>
-              <w:rPr>
-                <w:sz w:val="18"/>
-              </w:rPr>
-              <w:t>/fr/pret-renovation-energetique/</w:t>
-            </w:r>
-          </w:p>
-        </w:tc>
-        <w:tc>
-          <w:tcPr>
-            <w:tcW w:type="dxa" w:w="3135"/>
-            <w:shd w:fill="F5F5F5" w:val="clear"/>
-          </w:tcPr>
-          <w:p>
-            <w:pPr>
-              <w:spacing w:before="40" w:after="40"/>
-            </w:pPr>
-            <w:r>
-              <w:rPr>
-                <w:sz w:val="18"/>
-              </w:rPr>
-              <w:t>Travaux, Crédit général</w:t>
-            </w:r>
-          </w:p>
-        </w:tc>
-      </w:tr>
-      <w:tr>
-        <w:tc>
-          <w:tcPr>
-            <w:tcW w:type="dxa" w:w="3135"/>
-            <w:shd w:fill="FFFFFF" w:val="clear"/>
-          </w:tcPr>
-          <w:p>
-            <w:pPr>
-              <w:spacing w:before="40" w:after="40"/>
-            </w:pPr>
-            <w:r>
-              <w:rPr>
-                <w:sz w:val="18"/>
-              </w:rPr>
-              <w:t>Travaux</w:t>
-            </w:r>
-          </w:p>
-        </w:tc>
-        <w:tc>
-          <w:tcPr>
-            <w:tcW w:type="dxa" w:w="3135"/>
-            <w:shd w:fill="FFFFFF" w:val="clear"/>
-          </w:tcPr>
-          <w:p>
-            <w:pPr>
-              <w:spacing w:before="40" w:after="40"/>
-            </w:pPr>
-            <w:r>
-              <w:rPr>
-                <w:sz w:val="18"/>
-              </w:rPr>
-              <w:t>/fr/pret-personnel/pret-travaux/</w:t>
-            </w:r>
-          </w:p>
-        </w:tc>
-        <w:tc>
-          <w:tcPr>
-            <w:tcW w:type="dxa" w:w="3135"/>
-            <w:shd w:fill="FFFFFF" w:val="clear"/>
-          </w:tcPr>
-          <w:p>
-            <w:pPr>
-              <w:spacing w:before="40" w:after="40"/>
-            </w:pPr>
-            <w:r>
-              <w:rPr>
-                <w:sz w:val="18"/>
-              </w:rPr>
-              <w:t>Rénovation énergétique, Crédit cuisine, Crédit SDB</w:t>
-            </w:r>
-          </w:p>
-        </w:tc>
-      </w:tr>
-      <w:tr>
-        <w:tc>
-          <w:tcPr>
-            <w:tcW w:type="dxa" w:w="3135"/>
-            <w:shd w:fill="F5F5F5" w:val="clear"/>
-          </w:tcPr>
-          <w:p>
-            <w:pPr>
-              <w:spacing w:before="40" w:after="40"/>
-            </w:pPr>
-            <w:r>
-              <w:rPr>
-                <w:sz w:val="18"/>
-              </w:rPr>
-              <w:t>Crédit cuisine</w:t>
-            </w:r>
-          </w:p>
-        </w:tc>
-        <w:tc>
-          <w:tcPr>
-            <w:tcW w:type="dxa" w:w="3135"/>
-            <w:shd w:fill="F5F5F5" w:val="clear"/>
-          </w:tcPr>
-          <w:p>
-            <w:pPr>
-              <w:spacing w:before="40" w:after="40"/>
-            </w:pPr>
-            <w:r>
-              <w:rPr>
-                <w:sz w:val="18"/>
-              </w:rPr>
-              <w:t>/fr/pret-personnel/credit-cuisine/</w:t>
-            </w:r>
-          </w:p>
-        </w:tc>
-        <w:tc>
-          <w:tcPr>
-            <w:tcW w:type="dxa" w:w="3135"/>
-            <w:shd w:fill="F5F5F5" w:val="clear"/>
-          </w:tcPr>
-          <w:p>
-            <w:pPr>
-              <w:spacing w:before="40" w:after="40"/>
-            </w:pPr>
-            <w:r>
-              <w:rPr>
-                <w:sz w:val="18"/>
-              </w:rPr>
-              <w:t>Travaux, Crédit déco</w:t>
-            </w:r>
-          </w:p>
-        </w:tc>
-      </w:tr>
-      <w:tr>
-        <w:tc>
-          <w:tcPr>
-            <w:tcW w:type="dxa" w:w="3135"/>
-            <w:shd w:fill="FFFFFF" w:val="clear"/>
-          </w:tcPr>
-          <w:p>
-            <w:pPr>
-              <w:spacing w:before="40" w:after="40"/>
-            </w:pPr>
-            <w:r>
-              <w:rPr>
-                <w:sz w:val="18"/>
-              </w:rPr>
-              <w:t>Crédit auto</w:t>
-            </w:r>
-          </w:p>
-        </w:tc>
-        <w:tc>
-          <w:tcPr>
-            <w:tcW w:type="dxa" w:w="3135"/>
-            <w:shd w:fill="FFFFFF" w:val="clear"/>
-          </w:tcPr>
-          <w:p>
-            <w:pPr>
-              <w:spacing w:before="40" w:after="40"/>
-            </w:pPr>
-            <w:r>
-              <w:rPr>
-                <w:sz w:val="18"/>
-              </w:rPr>
-              <w:t>/fr/pret-personnel/credit-auto/ ou /fr/credit-auto/</w:t>
-            </w:r>
-          </w:p>
-        </w:tc>
-        <w:tc>
-          <w:tcPr>
-            <w:tcW w:type="dxa" w:w="3135"/>
-            <w:shd w:fill="FFFFFF" w:val="clear"/>
-          </w:tcPr>
-          <w:p>
-            <w:pPr>
-              <w:spacing w:before="40" w:after="40"/>
-            </w:pPr>
-            <w:r>
-              <w:rPr>
-                <w:sz w:val="18"/>
-              </w:rPr>
-              <w:t>Crédit moto</w:t>
-            </w:r>
-          </w:p>
-        </w:tc>
-      </w:tr>
-      <w:tr>
-        <w:tc>
-          <w:tcPr>
-            <w:tcW w:type="dxa" w:w="3135"/>
-            <w:shd w:fill="F5F5F5" w:val="clear"/>
-          </w:tcPr>
-          <w:p>
-            <w:pPr>
-              <w:spacing w:before="40" w:after="40"/>
-            </w:pPr>
-            <w:r>
-              <w:rPr>
-                <w:sz w:val="18"/>
-              </w:rPr>
-              <w:t>Crédit moto</w:t>
-            </w:r>
-          </w:p>
-        </w:tc>
-        <w:tc>
-          <w:tcPr>
-            <w:tcW w:type="dxa" w:w="3135"/>
-            <w:shd w:fill="F5F5F5" w:val="clear"/>
-          </w:tcPr>
-          <w:p>
-            <w:pPr>
-              <w:spacing w:before="40" w:after="40"/>
-            </w:pPr>
-            <w:r>
-              <w:rPr>
-                <w:sz w:val="18"/>
-              </w:rPr>
-              <w:t>/fr/pret-personnel/credit-moto-scooter/</w:t>
-            </w:r>
-          </w:p>
-        </w:tc>
-        <w:tc>
-          <w:tcPr>
-            <w:tcW w:type="dxa" w:w="3135"/>
-            <w:shd w:fill="F5F5F5" w:val="clear"/>
-          </w:tcPr>
-          <w:p>
-            <w:pPr>
-              <w:spacing w:before="40" w:after="40"/>
-            </w:pPr>
-            <w:r>
-              <w:rPr>
-                <w:sz w:val="18"/>
-              </w:rPr>
-              <w:t>Crédit auto</w:t>
-            </w:r>
-          </w:p>
-        </w:tc>
-      </w:tr>
-      <w:tr>
-        <w:tc>
-          <w:tcPr>
-            <w:tcW w:type="dxa" w:w="3135"/>
-            <w:shd w:fill="FFFFFF" w:val="clear"/>
-          </w:tcPr>
-          <w:p>
-            <w:pPr>
-              <w:spacing w:before="40" w:after="40"/>
-            </w:pPr>
-            <w:r>
-              <w:rPr>
-                <w:sz w:val="18"/>
-              </w:rPr>
-              <w:t>Crédit salle de bain</w:t>
-            </w:r>
-          </w:p>
-        </w:tc>
-        <w:tc>
-          <w:tcPr>
-            <w:tcW w:type="dxa" w:w="3135"/>
-            <w:shd w:fill="FFFFFF" w:val="clear"/>
-          </w:tcPr>
-          <w:p>
-            <w:pPr>
-              <w:spacing w:before="40" w:after="40"/>
-            </w:pPr>
-            <w:r>
-              <w:rPr>
-                <w:sz w:val="18"/>
-              </w:rPr>
-              <w:t>/fr/pret-personnel/credit-salle-de-bain/</w:t>
-            </w:r>
-          </w:p>
-        </w:tc>
-        <w:tc>
-          <w:tcPr>
-            <w:tcW w:type="dxa" w:w="3135"/>
-            <w:shd w:fill="FFFFFF" w:val="clear"/>
-          </w:tcPr>
-          <w:p>
-            <w:pPr>
-              <w:spacing w:before="40" w:after="40"/>
-            </w:pPr>
-            <w:r>
-              <w:rPr>
-                <w:sz w:val="18"/>
-              </w:rPr>
-              <w:t>Travaux, Crédit cuisine</w:t>
-            </w:r>
-          </w:p>
-        </w:tc>
-      </w:tr>
-      <w:tr>
-        <w:tc>
-          <w:tcPr>
-            <w:tcW w:type="dxa" w:w="3135"/>
-            <w:shd w:fill="F5F5F5" w:val="clear"/>
-          </w:tcPr>
-          <w:p>
-            <w:pPr>
-              <w:spacing w:before="40" w:after="40"/>
-            </w:pPr>
-            <w:r>
-              <w:rPr>
-                <w:sz w:val="18"/>
-              </w:rPr>
-              <w:t>Crédit déco</w:t>
-            </w:r>
-          </w:p>
-        </w:tc>
-        <w:tc>
-          <w:tcPr>
-            <w:tcW w:type="dxa" w:w="3135"/>
-            <w:shd w:fill="F5F5F5" w:val="clear"/>
-          </w:tcPr>
-          <w:p>
-            <w:pPr>
-              <w:spacing w:before="40" w:after="40"/>
-            </w:pPr>
-            <w:r>
-              <w:rPr>
-                <w:sz w:val="18"/>
-              </w:rPr>
-              <w:t>/fr/pret-personnel/credit-decoration/</w:t>
-            </w:r>
-          </w:p>
-        </w:tc>
-        <w:tc>
-          <w:tcPr>
-            <w:tcW w:type="dxa" w:w="3135"/>
-            <w:shd w:fill="F5F5F5" w:val="clear"/>
-          </w:tcPr>
-          <w:p>
-            <w:pPr>
-              <w:spacing w:before="40" w:after="40"/>
-            </w:pPr>
-            <w:r>
-              <w:rPr>
-                <w:sz w:val="18"/>
-              </w:rPr>
-              <w:t>Crédit cuisine, Travaux</w:t>
-            </w:r>
-          </w:p>
-        </w:tc>
-      </w:tr>
-      <w:tr>
-        <w:tc>
-          <w:tcPr>
-            <w:tcW w:type="dxa" w:w="3135"/>
-            <w:shd w:fill="FFFFFF" w:val="clear"/>
-          </w:tcPr>
-          <w:p>
-            <w:pPr>
-              <w:spacing w:before="40" w:after="40"/>
-            </w:pPr>
-            <w:r>
-              <w:rPr>
-                <w:sz w:val="18"/>
-              </w:rPr>
-              <w:t>Crédit piscine</w:t>
-            </w:r>
-          </w:p>
-        </w:tc>
-        <w:tc>
-          <w:tcPr>
-            <w:tcW w:type="dxa" w:w="3135"/>
-            <w:shd w:fill="FFFFFF" w:val="clear"/>
-          </w:tcPr>
-          <w:p>
-            <w:pPr>
-              <w:spacing w:before="40" w:after="40"/>
-            </w:pPr>
-            <w:r>
-              <w:rPr>
-                <w:sz w:val="18"/>
-              </w:rPr>
-              <w:t>/fr/pret-personnel/credit-piscine/</w:t>
-            </w:r>
-          </w:p>
-        </w:tc>
-        <w:tc>
-          <w:tcPr>
-            <w:tcW w:type="dxa" w:w="3135"/>
-            <w:shd w:fill="FFFFFF" w:val="clear"/>
-          </w:tcPr>
-          <w:p>
-            <w:pPr>
-              <w:spacing w:before="40" w:after="40"/>
-            </w:pPr>
-            <w:r>
-              <w:rPr>
-                <w:sz w:val="18"/>
-              </w:rPr>
-              <w:t>—</w:t>
-            </w:r>
-          </w:p>
-        </w:tc>
-      </w:tr>
-      <w:tr>
-        <w:tc>
-          <w:tcPr>
-            <w:tcW w:type="dxa" w:w="3135"/>
-            <w:shd w:fill="F5F5F5" w:val="clear"/>
-          </w:tcPr>
-          <w:p>
-            <w:pPr>
-              <w:spacing w:before="40" w:after="40"/>
-            </w:pPr>
-            <w:r>
-              <w:rPr>
-                <w:sz w:val="18"/>
-              </w:rPr>
-              <w:t>Crédit mariage</w:t>
-            </w:r>
-          </w:p>
-        </w:tc>
-        <w:tc>
-          <w:tcPr>
-            <w:tcW w:type="dxa" w:w="3135"/>
-            <w:shd w:fill="F5F5F5" w:val="clear"/>
-          </w:tcPr>
-          <w:p>
-            <w:pPr>
-              <w:spacing w:before="40" w:after="40"/>
-            </w:pPr>
-            <w:r>
-              <w:rPr>
-                <w:sz w:val="18"/>
-              </w:rPr>
-              <w:t>/fr/pret-personnel/credit-mariage/</w:t>
-            </w:r>
-          </w:p>
-        </w:tc>
-        <w:tc>
-          <w:tcPr>
-            <w:tcW w:type="dxa" w:w="3135"/>
-            <w:shd w:fill="F5F5F5" w:val="clear"/>
-          </w:tcPr>
-          <w:p>
-            <w:pPr>
-              <w:spacing w:before="40" w:after="40"/>
-            </w:pPr>
-            <w:r>
-              <w:rPr>
-                <w:sz w:val="18"/>
-              </w:rPr>
-              <w:t>—</w:t>
-            </w:r>
-          </w:p>
-        </w:tc>
-      </w:tr>
-      <w:tr>
-        <w:tc>
-          <w:tcPr>
-            <w:tcW w:type="dxa" w:w="3135"/>
-            <w:shd w:fill="FFFFFF" w:val="clear"/>
-          </w:tcPr>
-          <w:p>
-            <w:pPr>
-              <w:spacing w:before="40" w:after="40"/>
-            </w:pPr>
-            <w:r>
-              <w:rPr>
-                <w:sz w:val="18"/>
-              </w:rPr>
-              <w:t>Crédit voyage</w:t>
-            </w:r>
-          </w:p>
-        </w:tc>
-        <w:tc>
-          <w:tcPr>
-            <w:tcW w:type="dxa" w:w="3135"/>
-            <w:shd w:fill="FFFFFF" w:val="clear"/>
-          </w:tcPr>
-          <w:p>
-            <w:pPr>
-              <w:spacing w:before="40" w:after="40"/>
-            </w:pPr>
-            <w:r>
-              <w:rPr>
-                <w:sz w:val="18"/>
-              </w:rPr>
-              <w:t>/fr/pret-personnel/credit-voyage/</w:t>
-            </w:r>
-          </w:p>
-        </w:tc>
-        <w:tc>
-          <w:tcPr>
-            <w:tcW w:type="dxa" w:w="3135"/>
-            <w:shd w:fill="FFFFFF" w:val="clear"/>
-          </w:tcPr>
-          <w:p>
-            <w:pPr>
-              <w:spacing w:before="40" w:after="40"/>
-            </w:pPr>
-            <w:r>
-              <w:rPr>
-                <w:sz w:val="18"/>
-              </w:rPr>
-              <w:t>—</w:t>
-            </w:r>
-          </w:p>
-        </w:tc>
-      </w:tr>
-      <w:tr>
-        <w:tc>
-          <w:tcPr>
-            <w:tcW w:type="dxa" w:w="3135"/>
-            <w:shd w:fill="F5F5F5" w:val="clear"/>
-          </w:tcPr>
-          <w:p>
-            <w:pPr>
-              <w:spacing w:before="40" w:after="40"/>
-            </w:pPr>
-            <w:r>
-              <w:rPr>
-                <w:sz w:val="18"/>
-              </w:rPr>
-              <w:t>Prêt personnel (générique)</w:t>
-            </w:r>
-          </w:p>
-        </w:tc>
-        <w:tc>
-          <w:tcPr>
-            <w:tcW w:type="dxa" w:w="3135"/>
-            <w:shd w:fill="F5F5F5" w:val="clear"/>
-          </w:tcPr>
-          <w:p>
-            <w:pPr>
-              <w:spacing w:before="40" w:after="40"/>
-            </w:pPr>
-            <w:r>
-              <w:rPr>
-                <w:sz w:val="18"/>
-              </w:rPr>
-              <w:t>/fr/pret-personnel/ (autres)</w:t>
-            </w:r>
-          </w:p>
-        </w:tc>
-        <w:tc>
-          <w:tcPr>
-            <w:tcW w:type="dxa" w:w="3135"/>
-            <w:shd w:fill="F5F5F5" w:val="clear"/>
-          </w:tcPr>
-          <w:p>
-            <w:pPr>
-              <w:spacing w:before="40" w:after="40"/>
-            </w:pPr>
-            <w:r>
-              <w:rPr>
-                <w:sz w:val="18"/>
-              </w:rPr>
-              <w:t>Crédit général</w:t>
-            </w:r>
-          </w:p>
-        </w:tc>
-      </w:tr>
-      <w:tr>
-        <w:tc>
-          <w:tcPr>
-            <w:tcW w:type="dxa" w:w="3135"/>
-            <w:shd w:fill="FFFFFF" w:val="clear"/>
-          </w:tcPr>
-          <w:p>
-            <w:pPr>
-              <w:spacing w:before="40" w:after="40"/>
-            </w:pPr>
-            <w:r>
-              <w:rPr>
-                <w:sz w:val="18"/>
-              </w:rPr>
-              <w:t>Crédit général</w:t>
-            </w:r>
-          </w:p>
-        </w:tc>
-        <w:tc>
-          <w:tcPr>
-            <w:tcW w:type="dxa" w:w="3135"/>
-            <w:shd w:fill="FFFFFF" w:val="clear"/>
-          </w:tcPr>
-          <w:p>
-            <w:pPr>
-              <w:spacing w:before="40" w:after="40"/>
-            </w:pPr>
-            <w:r>
-              <w:rPr>
-                <w:sz w:val="18"/>
-              </w:rPr>
-              <w:t>/fr/credit/, /fr/guide-credit/</w:t>
-            </w:r>
-          </w:p>
-        </w:tc>
-        <w:tc>
-          <w:tcPr>
-            <w:tcW w:type="dxa" w:w="3135"/>
-            <w:shd w:fill="FFFFFF" w:val="clear"/>
-          </w:tcPr>
-          <w:p>
-            <w:pPr>
-              <w:spacing w:before="40" w:after="40"/>
-            </w:pPr>
-            <w:r>
-              <w:rPr>
-                <w:sz w:val="18"/>
-              </w:rPr>
-              <w:t>Prêt personnel, Rachat de crédit</w:t>
-            </w:r>
-          </w:p>
-        </w:tc>
-      </w:tr>
-      <w:tr>
-        <w:tc>
-          <w:tcPr>
-            <w:tcW w:type="dxa" w:w="3135"/>
-            <w:shd w:fill="F5F5F5" w:val="clear"/>
-          </w:tcPr>
-          <w:p>
-            <w:pPr>
-              <w:spacing w:before="40" w:after="40"/>
-            </w:pPr>
-            <w:r>
-              <w:rPr>
-                <w:sz w:val="18"/>
-              </w:rPr>
-              <w:t>Rachat de crédit</w:t>
-            </w:r>
-          </w:p>
-        </w:tc>
-        <w:tc>
-          <w:tcPr>
-            <w:tcW w:type="dxa" w:w="3135"/>
-            <w:shd w:fill="F5F5F5" w:val="clear"/>
-          </w:tcPr>
-          <w:p>
-            <w:pPr>
-              <w:spacing w:before="40" w:after="40"/>
-            </w:pPr>
-            <w:r>
-              <w:rPr>
-                <w:sz w:val="18"/>
-              </w:rPr>
-              <w:t>/fr/rachat-de-credit/</w:t>
-            </w:r>
-          </w:p>
-        </w:tc>
-        <w:tc>
-          <w:tcPr>
-            <w:tcW w:type="dxa" w:w="3135"/>
-            <w:shd w:fill="F5F5F5" w:val="clear"/>
-          </w:tcPr>
-          <w:p>
-            <w:pPr>
-              <w:spacing w:before="40" w:after="40"/>
-            </w:pPr>
-            <w:r>
-              <w:rPr>
-                <w:sz w:val="18"/>
-              </w:rPr>
-              <w:t>Crédit général</w:t>
-            </w:r>
-          </w:p>
-        </w:tc>
-      </w:tr>
-    </w:tbl>
-    <w:p/>
-    <w:p>
-      <w:pPr>
-        <w:spacing w:before="280" w:after="80"/>
-      </w:pPr>
-      <w:r>
-        <w:rPr>
-          <w:b/>
-          <w:color w:val="1A1A2E"/>
-          <w:sz w:val="28"/>
-        </w:rPr>
-        <w:t>5. Livrable</w:t>
-      </w:r>
-    </w:p>
-    <w:p>
-      <w:pPr>
-        <w:spacing w:after="80"/>
-      </w:pPr>
-      <w:r>
-        <w:t>Un fichier Excel cofidis_maillage_mapping.xlsx sera généré avec :</w:t>
-      </w:r>
-    </w:p>
-    <w:p>
-      <w:pPr>
-        <w:pStyle w:val="ListBullet"/>
-        <w:spacing w:after="40"/>
-      </w:pPr>
-      <w:r>
-        <w:rPr>
-          <w:b/>
-          <w:sz w:val="20"/>
-        </w:rPr>
-        <w:t xml:space="preserve">Onglet Mapping : </w:t>
-      </w:r>
-      <w:r>
-        <w:rPr>
-          <w:sz w:val="20"/>
-        </w:rPr>
-        <w:t>pour chaque page, les URLs de chaque bloc prêtes à intégrer</w:t>
-      </w:r>
-    </w:p>
-    <w:p>
-      <w:pPr>
-        <w:pStyle w:val="ListBullet"/>
-        <w:spacing w:after="40"/>
-      </w:pPr>
-      <w:r>
-        <w:rPr>
-          <w:b/>
-          <w:sz w:val="20"/>
-        </w:rPr>
-        <w:t xml:space="preserve">Onglet Inventaire : </w:t>
-      </w:r>
-      <w:r>
-        <w:rPr>
-          <w:sz w:val="20"/>
-        </w:rPr>
-        <w:t>toutes les URLs du site classées par type et par thème</w:t>
+        <w:t>Note : si un sujet n'a pas assez de guides (moins de 4), compléter avec des guides de sujets proches. Ex : Crédit cuisine → compléter avec des guides Travaux ou Crédit déco.</w:t>
       </w:r>
     </w:p>
     <w:sectPr>

</xml_diff>